<commit_message>
Update 2026-10-06 deck and email news to the three specified headlines
Replace the Word-doc news (agri-forestry / Ha Tinh / Long Thanh) with the
headlines the user requested: World Bank GDP upgrade to 7.4%, Thu Dau Mot-HCMC
metro line approval, and Vietnam's MSCI/FTSE upgrade target.

Co-Authored-By: Claude Opus 4.8 <noreply@anthropic.com>
Claude-Session: https://claude.ai/code/session_01M7EtkZ1WsWb9Cfy2p8P7GB
</commit_message>
<xml_diff>
--- a/DailyReport_Email_EN_20261006.docx
+++ b/DailyReport_Email_EN_20261006.docx
@@ -813,7 +813,7 @@
                                   <w:b/>
                                   <w:bCs/>
                                 </w:rPr>
-                                <w:t>Agri-Forestry trade surplus reaches USD16.9bn</w:t>
+                                <w:t>World Bank upgrades Vietnam 2026 GDP growth outlook to 7.4 percent</w:t>
                               </w:r>
                               <w:r>
                                 <w:rPr>
@@ -854,7 +854,7 @@
                                   <w:b/>
                                   <w:bCs/>
                                 </w:rPr>
-                                <w:t>Ha Tinh approves VND326bn pharmaceutical complex</w:t>
+                                <w:t>Thu Dau Mot - Ho Chi Minh City metro line project approved</w:t>
                               </w:r>
                             </w:p>
                             <w:p>
@@ -888,7 +888,7 @@
                                   <w:b/>
                                   <w:bCs/>
                                 </w:rPr>
-                                <w:t>Long Thanh airport targets December launch via three-phase trial framework</w:t>
+                                <w:t>Vietnam targets MSCI upgrade and FTSE secondary emerging market status</w:t>
                               </w:r>
                               <w:r/>
                               <w:r>

</xml_diff>